<commit_message>
edu practice added ability to change element of list
</commit_message>
<xml_diff>
--- a/educational_practice/Содержание задания на практику_20.docx
+++ b/educational_practice/Содержание задания на практику_20.docx
@@ -1,10 +1,10 @@
 
 <file path=word/document.xml><?xml version="1.0" encoding="utf-8"?>
-<w:document xmlns:wpc="http://schemas.microsoft.com/office/word/2010/wordprocessingCanvas" xmlns:mc="http://schemas.openxmlformats.org/markup-compatibility/2006" xmlns:o="urn:schemas-microsoft-com:office:office" xmlns:r="http://schemas.openxmlformats.org/officeDocument/2006/relationships" xmlns:m="http://schemas.openxmlformats.org/officeDocument/2006/math" xmlns:v="urn:schemas-microsoft-com:vml" xmlns:wp14="http://schemas.microsoft.com/office/word/2010/wordprocessingDrawing" xmlns:wp="http://schemas.openxmlformats.org/drawingml/2006/wordprocessingDrawing" xmlns:w10="urn:schemas-microsoft-com:office:word" xmlns:w="http://schemas.openxmlformats.org/wordprocessingml/2006/main" xmlns:w14="http://schemas.microsoft.com/office/word/2010/wordml" xmlns:w15="http://schemas.microsoft.com/office/word/2012/wordml" xmlns:wpg="http://schemas.microsoft.com/office/word/2010/wordprocessingGroup" xmlns:wpi="http://schemas.microsoft.com/office/word/2010/wordprocessingInk" xmlns:wne="http://schemas.microsoft.com/office/word/2006/wordml" xmlns:wps="http://schemas.microsoft.com/office/word/2010/wordprocessingShape" mc:Ignorable="w14 w15 wp14">
+<w:document xmlns:wpc="http://schemas.microsoft.com/office/word/2010/wordprocessingCanvas" xmlns:cx="http://schemas.microsoft.com/office/drawing/2014/chartex" xmlns:cx1="http://schemas.microsoft.com/office/drawing/2015/9/8/chartex" xmlns:cx2="http://schemas.microsoft.com/office/drawing/2015/10/21/chartex" xmlns:cx3="http://schemas.microsoft.com/office/drawing/2016/5/9/chartex" xmlns:cx4="http://schemas.microsoft.com/office/drawing/2016/5/10/chartex" xmlns:cx5="http://schemas.microsoft.com/office/drawing/2016/5/11/chartex" xmlns:cx6="http://schemas.microsoft.com/office/drawing/2016/5/12/chartex" xmlns:cx7="http://schemas.microsoft.com/office/drawing/2016/5/13/chartex" xmlns:cx8="http://schemas.microsoft.com/office/drawing/2016/5/14/chartex" xmlns:mc="http://schemas.openxmlformats.org/markup-compatibility/2006" xmlns:aink="http://schemas.microsoft.com/office/drawing/2016/ink" xmlns:am3d="http://schemas.microsoft.com/office/drawing/2017/model3d" xmlns:o="urn:schemas-microsoft-com:office:office" xmlns:oel="http://schemas.microsoft.com/office/2019/extlst" xmlns:r="http://schemas.openxmlformats.org/officeDocument/2006/relationships" xmlns:m="http://schemas.openxmlformats.org/officeDocument/2006/math" xmlns:v="urn:schemas-microsoft-com:vml" xmlns:wp14="http://schemas.microsoft.com/office/word/2010/wordprocessingDrawing" xmlns:wp="http://schemas.openxmlformats.org/drawingml/2006/wordprocessingDrawing" xmlns:a="http://schemas.openxmlformats.org/drawingml/2006/main" xmlns:pic="http://schemas.openxmlformats.org/drawingml/2006/picture" xmlns:c="http://schemas.openxmlformats.org/drawingml/2006/chart" xmlns:dgm="http://schemas.openxmlformats.org/drawingml/2006/diagram" xmlns:lc="http://schemas.openxmlformats.org/drawingml/2006/lockedCanvas" xmlns:w10="urn:schemas-microsoft-com:office:word" xmlns:w="http://schemas.openxmlformats.org/wordprocessingml/2006/main" xmlns:w14="http://schemas.microsoft.com/office/word/2010/wordml" xmlns:w15="http://schemas.microsoft.com/office/word/2012/wordml" xmlns:w16cex="http://schemas.microsoft.com/office/word/2018/wordml/cex" xmlns:w16cid="http://schemas.microsoft.com/office/word/2016/wordml/cid" xmlns:w16="http://schemas.microsoft.com/office/word/2018/wordml" xmlns:w16du="http://schemas.microsoft.com/office/word/2023/wordml/word16du" xmlns:w16sdtdh="http://schemas.microsoft.com/office/word/2020/wordml/sdtdatahash" xmlns:w16sdtfl="http://schemas.microsoft.com/office/word/2024/wordml/sdtformatlock" xmlns:w16se="http://schemas.microsoft.com/office/word/2015/wordml/symex" xmlns:wpg="http://schemas.microsoft.com/office/word/2010/wordprocessingGroup" xmlns:wpi="http://schemas.microsoft.com/office/word/2010/wordprocessingInk" xmlns:wne="http://schemas.microsoft.com/office/word/2006/wordml" xmlns:wps="http://schemas.microsoft.com/office/word/2010/wordprocessingShape" mc:Ignorable="w14 w15 w16se w16cid w16 w16cex w16sdtdh w16sdtfl w16du wp14">
   <w:body>
     <w:p>
       <w:pPr>
-        <w:shd w:val="clear" w:color="auto" w:fill="FFFFFF"/>
+        <w:shd w:color="auto" w:fill="FFFFFF" w:val="clear"/>
         <w:tabs>
           <w:tab w:val="left" w:pos="916"/>
           <w:tab w:val="left" w:pos="1832"/>
@@ -26,7 +26,7 @@
         <w:spacing w:after="0" w:line="240" w:lineRule="auto"/>
         <w:jc w:val="both"/>
         <w:rPr>
-          <w:rFonts w:ascii="Times New Roman" w:eastAsia="Times New Roman" w:hAnsi="Times New Roman"/>
+          <w:rFonts w:ascii="Times New Roman" w:hAnsi="Times New Roman" w:eastAsia="Times New Roman"/>
           <w:color w:val="000000"/>
           <w:sz w:val="28"/>
           <w:szCs w:val="28"/>
@@ -37,18 +37,19 @@
       <w:bookmarkEnd w:id="0"/>
       <w:r>
         <w:rPr>
-          <w:rFonts w:ascii="Times New Roman" w:eastAsia="Times New Roman" w:hAnsi="Times New Roman"/>
-          <w:color w:val="000000"/>
-          <w:sz w:val="28"/>
-          <w:szCs w:val="28"/>
-          <w:lang w:eastAsia="ru-RU"/>
+          <w:rFonts w:ascii="Times New Roman" w:hAnsi="Times New Roman" w:eastAsia="Times New Roman" w:cs="Times New Roman"/>
+          <w:color w:val="000000"/>
+          <w:sz w:val="28"/>
+          <w:szCs w:val="28"/>
+          <w:lang w:val="ru-RU" w:eastAsia="ru-RU" w:bidi="ar-SA"/>
+          <w:highlight w:val="white"/>
         </w:rPr>
         <w:t>Содержание задания на практику:</w:t>
       </w:r>
     </w:p>
     <w:p>
       <w:pPr>
-        <w:shd w:val="clear" w:color="auto" w:fill="FFFFFF"/>
+        <w:shd w:color="auto" w:fill="FFFFFF" w:val="clear"/>
         <w:tabs>
           <w:tab w:val="left" w:pos="916"/>
           <w:tab w:val="left" w:pos="1832"/>
@@ -70,7 +71,7 @@
         <w:spacing w:after="0" w:line="240" w:lineRule="auto"/>
         <w:jc w:val="both"/>
         <w:rPr>
-          <w:rFonts w:ascii="Times New Roman" w:eastAsia="Times New Roman" w:hAnsi="Times New Roman"/>
+          <w:rFonts w:ascii="Times New Roman" w:hAnsi="Times New Roman" w:eastAsia="Times New Roman"/>
           <w:color w:val="000000"/>
           <w:sz w:val="28"/>
           <w:szCs w:val="28"/>
@@ -79,138 +80,151 @@
       </w:pPr>
       <w:r>
         <w:rPr>
-          <w:rFonts w:ascii="Times New Roman" w:eastAsia="Times New Roman" w:hAnsi="Times New Roman"/>
-          <w:color w:val="000000"/>
-          <w:sz w:val="28"/>
-          <w:szCs w:val="28"/>
-          <w:lang w:eastAsia="ru-RU"/>
+          <w:rFonts w:ascii="Times New Roman" w:hAnsi="Times New Roman" w:eastAsia="Times New Roman" w:cs="Times New Roman"/>
+          <w:color w:val="000000"/>
+          <w:sz w:val="28"/>
+          <w:szCs w:val="28"/>
+          <w:lang w:val="ru-RU" w:eastAsia="ru-RU" w:bidi="ar-SA"/>
+          <w:highlight w:val="white"/>
         </w:rPr>
         <w:t>Для выбранного варианта реализовать программу, работающую с</w:t>
       </w:r>
       <w:r>
         <w:rPr>
-          <w:rFonts w:ascii="Times New Roman" w:eastAsia="Times New Roman" w:hAnsi="Times New Roman"/>
-          <w:color w:val="000000"/>
-          <w:sz w:val="28"/>
-          <w:szCs w:val="28"/>
-          <w:lang w:eastAsia="ru-RU"/>
+          <w:rFonts w:ascii="Times New Roman" w:hAnsi="Times New Roman" w:eastAsia="Times New Roman" w:cs="Times New Roman"/>
+          <w:color w:val="000000"/>
+          <w:sz w:val="28"/>
+          <w:szCs w:val="28"/>
+          <w:lang w:val="ru-RU" w:eastAsia="ru-RU" w:bidi="ar-SA"/>
+          <w:highlight w:val="white"/>
         </w:rPr>
         <w:t xml:space="preserve"> </w:t>
       </w:r>
       <w:r>
         <w:rPr>
-          <w:rFonts w:ascii="Times New Roman" w:eastAsia="Times New Roman" w:hAnsi="Times New Roman"/>
-          <w:color w:val="000000"/>
-          <w:sz w:val="28"/>
-          <w:szCs w:val="28"/>
-          <w:lang w:eastAsia="ru-RU"/>
+          <w:rFonts w:ascii="Times New Roman" w:hAnsi="Times New Roman" w:eastAsia="Times New Roman" w:cs="Times New Roman"/>
+          <w:color w:val="000000"/>
+          <w:sz w:val="28"/>
+          <w:szCs w:val="28"/>
+          <w:lang w:val="ru-RU" w:eastAsia="ru-RU" w:bidi="ar-SA"/>
+          <w:highlight w:val="white"/>
         </w:rPr>
         <w:t>типизированными файлами. При выборе пункта меню 1 должно производиться</w:t>
       </w:r>
       <w:r>
         <w:rPr>
-          <w:rFonts w:ascii="Times New Roman" w:eastAsia="Times New Roman" w:hAnsi="Times New Roman"/>
-          <w:color w:val="000000"/>
-          <w:sz w:val="28"/>
-          <w:szCs w:val="28"/>
-          <w:lang w:eastAsia="ru-RU"/>
+          <w:rFonts w:ascii="Times New Roman" w:hAnsi="Times New Roman" w:eastAsia="Times New Roman" w:cs="Times New Roman"/>
+          <w:color w:val="000000"/>
+          <w:sz w:val="28"/>
+          <w:szCs w:val="28"/>
+          <w:lang w:val="ru-RU" w:eastAsia="ru-RU" w:bidi="ar-SA"/>
+          <w:highlight w:val="white"/>
         </w:rPr>
         <w:t xml:space="preserve"> </w:t>
       </w:r>
       <w:r>
         <w:rPr>
-          <w:rFonts w:ascii="Times New Roman" w:eastAsia="Times New Roman" w:hAnsi="Times New Roman"/>
-          <w:color w:val="000000"/>
-          <w:sz w:val="28"/>
-          <w:szCs w:val="28"/>
-          <w:lang w:eastAsia="ru-RU"/>
+          <w:rFonts w:ascii="Times New Roman" w:hAnsi="Times New Roman" w:eastAsia="Times New Roman" w:cs="Times New Roman"/>
+          <w:color w:val="000000"/>
+          <w:sz w:val="28"/>
+          <w:szCs w:val="28"/>
+          <w:lang w:val="ru-RU" w:eastAsia="ru-RU" w:bidi="ar-SA"/>
+          <w:highlight w:val="white"/>
         </w:rPr>
         <w:t>чтение данных из файлов, созданных и сохраненных ранее в соответствующие</w:t>
       </w:r>
       <w:r>
         <w:rPr>
-          <w:rFonts w:ascii="Times New Roman" w:eastAsia="Times New Roman" w:hAnsi="Times New Roman"/>
-          <w:color w:val="000000"/>
-          <w:sz w:val="28"/>
-          <w:szCs w:val="28"/>
-          <w:lang w:eastAsia="ru-RU"/>
+          <w:rFonts w:ascii="Times New Roman" w:hAnsi="Times New Roman" w:eastAsia="Times New Roman" w:cs="Times New Roman"/>
+          <w:color w:val="000000"/>
+          <w:sz w:val="28"/>
+          <w:szCs w:val="28"/>
+          <w:lang w:val="ru-RU" w:eastAsia="ru-RU" w:bidi="ar-SA"/>
+          <w:highlight w:val="white"/>
         </w:rPr>
         <w:t xml:space="preserve"> </w:t>
       </w:r>
       <w:r>
         <w:rPr>
-          <w:rFonts w:ascii="Times New Roman" w:eastAsia="Times New Roman" w:hAnsi="Times New Roman"/>
-          <w:color w:val="000000"/>
-          <w:sz w:val="28"/>
-          <w:szCs w:val="28"/>
-          <w:lang w:eastAsia="ru-RU"/>
+          <w:rFonts w:ascii="Times New Roman" w:hAnsi="Times New Roman" w:eastAsia="Times New Roman" w:cs="Times New Roman"/>
+          <w:color w:val="000000"/>
+          <w:sz w:val="28"/>
+          <w:szCs w:val="28"/>
+          <w:lang w:val="ru-RU" w:eastAsia="ru-RU" w:bidi="ar-SA"/>
+          <w:highlight w:val="white"/>
         </w:rPr>
         <w:t>им по типу и назначению динамические списки. Дальнейшие манипуляции над</w:t>
       </w:r>
       <w:r>
         <w:rPr>
-          <w:rFonts w:ascii="Times New Roman" w:eastAsia="Times New Roman" w:hAnsi="Times New Roman"/>
-          <w:color w:val="000000"/>
-          <w:sz w:val="28"/>
-          <w:szCs w:val="28"/>
-          <w:lang w:eastAsia="ru-RU"/>
+          <w:rFonts w:ascii="Times New Roman" w:hAnsi="Times New Roman" w:eastAsia="Times New Roman" w:cs="Times New Roman"/>
+          <w:color w:val="000000"/>
+          <w:sz w:val="28"/>
+          <w:szCs w:val="28"/>
+          <w:lang w:val="ru-RU" w:eastAsia="ru-RU" w:bidi="ar-SA"/>
+          <w:highlight w:val="white"/>
         </w:rPr>
         <w:t xml:space="preserve"> </w:t>
       </w:r>
       <w:r>
         <w:rPr>
-          <w:rFonts w:ascii="Times New Roman" w:eastAsia="Times New Roman" w:hAnsi="Times New Roman"/>
-          <w:color w:val="000000"/>
-          <w:sz w:val="28"/>
-          <w:szCs w:val="28"/>
-          <w:lang w:eastAsia="ru-RU"/>
+          <w:rFonts w:ascii="Times New Roman" w:hAnsi="Times New Roman" w:eastAsia="Times New Roman" w:cs="Times New Roman"/>
+          <w:color w:val="000000"/>
+          <w:sz w:val="28"/>
+          <w:szCs w:val="28"/>
+          <w:lang w:val="ru-RU" w:eastAsia="ru-RU" w:bidi="ar-SA"/>
+          <w:highlight w:val="white"/>
         </w:rPr>
         <w:t>данными выполняются в динамических списках. В момент, когда выбран пункт</w:t>
       </w:r>
       <w:r>
         <w:rPr>
-          <w:rFonts w:ascii="Times New Roman" w:eastAsia="Times New Roman" w:hAnsi="Times New Roman"/>
-          <w:color w:val="000000"/>
-          <w:sz w:val="28"/>
-          <w:szCs w:val="28"/>
-          <w:lang w:eastAsia="ru-RU"/>
+          <w:rFonts w:ascii="Times New Roman" w:hAnsi="Times New Roman" w:eastAsia="Times New Roman" w:cs="Times New Roman"/>
+          <w:color w:val="000000"/>
+          <w:sz w:val="28"/>
+          <w:szCs w:val="28"/>
+          <w:lang w:val="ru-RU" w:eastAsia="ru-RU" w:bidi="ar-SA"/>
+          <w:highlight w:val="white"/>
         </w:rPr>
         <w:t xml:space="preserve"> </w:t>
       </w:r>
       <w:r>
         <w:rPr>
-          <w:rFonts w:ascii="Times New Roman" w:eastAsia="Times New Roman" w:hAnsi="Times New Roman"/>
-          <w:color w:val="000000"/>
-          <w:sz w:val="28"/>
-          <w:szCs w:val="28"/>
-          <w:lang w:eastAsia="ru-RU"/>
+          <w:rFonts w:ascii="Times New Roman" w:hAnsi="Times New Roman" w:eastAsia="Times New Roman" w:cs="Times New Roman"/>
+          <w:color w:val="000000"/>
+          <w:sz w:val="28"/>
+          <w:szCs w:val="28"/>
+          <w:lang w:val="ru-RU" w:eastAsia="ru-RU" w:bidi="ar-SA"/>
+          <w:highlight w:val="white"/>
         </w:rPr>
         <w:t>меню 10, перезаписываются типизированные файлы данными из соответствующих</w:t>
       </w:r>
       <w:r>
         <w:rPr>
-          <w:rFonts w:ascii="Times New Roman" w:eastAsia="Times New Roman" w:hAnsi="Times New Roman"/>
-          <w:color w:val="000000"/>
-          <w:sz w:val="28"/>
-          <w:szCs w:val="28"/>
-          <w:lang w:eastAsia="ru-RU"/>
+          <w:rFonts w:ascii="Times New Roman" w:hAnsi="Times New Roman" w:eastAsia="Times New Roman" w:cs="Times New Roman"/>
+          <w:color w:val="000000"/>
+          <w:sz w:val="28"/>
+          <w:szCs w:val="28"/>
+          <w:lang w:val="ru-RU" w:eastAsia="ru-RU" w:bidi="ar-SA"/>
+          <w:highlight w:val="white"/>
         </w:rPr>
         <w:t xml:space="preserve"> </w:t>
       </w:r>
       <w:r>
         <w:rPr>
-          <w:rFonts w:ascii="Times New Roman" w:eastAsia="Times New Roman" w:hAnsi="Times New Roman"/>
-          <w:color w:val="000000"/>
-          <w:sz w:val="28"/>
-          <w:szCs w:val="28"/>
-          <w:lang w:eastAsia="ru-RU"/>
+          <w:rFonts w:ascii="Times New Roman" w:hAnsi="Times New Roman" w:eastAsia="Times New Roman" w:cs="Times New Roman"/>
+          <w:color w:val="000000"/>
+          <w:sz w:val="28"/>
+          <w:szCs w:val="28"/>
+          <w:lang w:val="ru-RU" w:eastAsia="ru-RU" w:bidi="ar-SA"/>
+          <w:highlight w:val="white"/>
         </w:rPr>
         <w:t>динамических списков.</w:t>
       </w:r>
     </w:p>
     <w:p>
       <w:pPr>
-        <w:shd w:val="clear" w:color="auto" w:fill="FFFFFF"/>
+        <w:shd w:color="auto" w:fill="FFFFFF" w:val="clear"/>
         <w:tabs>
           <w:tab w:val="left" w:pos="916"/>
           <w:tab w:val="left" w:pos="1832"/>
@@ -232,7 +246,7 @@
         <w:spacing w:after="0" w:line="240" w:lineRule="auto"/>
         <w:jc w:val="both"/>
         <w:rPr>
-          <w:rFonts w:ascii="Times New Roman" w:eastAsia="Times New Roman" w:hAnsi="Times New Roman"/>
+          <w:rFonts w:ascii="Times New Roman" w:hAnsi="Times New Roman" w:eastAsia="Times New Roman"/>
           <w:color w:val="000000"/>
           <w:sz w:val="28"/>
           <w:szCs w:val="28"/>
@@ -241,38 +255,41 @@
       </w:pPr>
       <w:r>
         <w:rPr>
-          <w:rFonts w:ascii="Times New Roman" w:eastAsia="Times New Roman" w:hAnsi="Times New Roman"/>
-          <w:color w:val="000000"/>
-          <w:sz w:val="28"/>
-          <w:szCs w:val="28"/>
-          <w:lang w:eastAsia="ru-RU"/>
+          <w:rFonts w:ascii="Times New Roman" w:hAnsi="Times New Roman" w:eastAsia="Times New Roman" w:cs="Times New Roman"/>
+          <w:color w:val="000000"/>
+          <w:sz w:val="28"/>
+          <w:szCs w:val="28"/>
+          <w:lang w:val="ru-RU" w:eastAsia="ru-RU" w:bidi="ar-SA"/>
+          <w:highlight w:val="white"/>
         </w:rPr>
         <w:t>Программа должна содержать пользовательское меню, состоящее из следующих</w:t>
       </w:r>
       <w:r>
         <w:rPr>
-          <w:rFonts w:ascii="Times New Roman" w:eastAsia="Times New Roman" w:hAnsi="Times New Roman"/>
-          <w:color w:val="000000"/>
-          <w:sz w:val="28"/>
-          <w:szCs w:val="28"/>
-          <w:lang w:eastAsia="ru-RU"/>
+          <w:rFonts w:ascii="Times New Roman" w:hAnsi="Times New Roman" w:eastAsia="Times New Roman" w:cs="Times New Roman"/>
+          <w:color w:val="000000"/>
+          <w:sz w:val="28"/>
+          <w:szCs w:val="28"/>
+          <w:lang w:val="ru-RU" w:eastAsia="ru-RU" w:bidi="ar-SA"/>
+          <w:highlight w:val="white"/>
         </w:rPr>
         <w:t xml:space="preserve"> </w:t>
       </w:r>
       <w:r>
         <w:rPr>
-          <w:rFonts w:ascii="Times New Roman" w:eastAsia="Times New Roman" w:hAnsi="Times New Roman"/>
-          <w:color w:val="000000"/>
-          <w:sz w:val="28"/>
-          <w:szCs w:val="28"/>
-          <w:lang w:eastAsia="ru-RU"/>
+          <w:rFonts w:ascii="Times New Roman" w:hAnsi="Times New Roman" w:eastAsia="Times New Roman" w:cs="Times New Roman"/>
+          <w:color w:val="000000"/>
+          <w:sz w:val="28"/>
+          <w:szCs w:val="28"/>
+          <w:lang w:val="ru-RU" w:eastAsia="ru-RU" w:bidi="ar-SA"/>
+          <w:highlight w:val="white"/>
         </w:rPr>
         <w:t>пунктов:</w:t>
       </w:r>
     </w:p>
     <w:p>
       <w:pPr>
-        <w:shd w:val="clear" w:color="auto" w:fill="FFFFFF"/>
+        <w:shd w:color="auto" w:fill="FFFFFF" w:val="clear"/>
         <w:tabs>
           <w:tab w:val="left" w:pos="916"/>
           <w:tab w:val="left" w:pos="1832"/>
@@ -294,7 +311,7 @@
         <w:spacing w:after="0" w:line="240" w:lineRule="auto"/>
         <w:jc w:val="both"/>
         <w:rPr>
-          <w:rFonts w:ascii="Times New Roman" w:eastAsia="Times New Roman" w:hAnsi="Times New Roman"/>
+          <w:rFonts w:ascii="Times New Roman" w:hAnsi="Times New Roman" w:eastAsia="Times New Roman"/>
           <w:color w:val="000000"/>
           <w:sz w:val="28"/>
           <w:szCs w:val="28"/>
@@ -303,18 +320,19 @@
       </w:pPr>
       <w:r>
         <w:rPr>
-          <w:rFonts w:ascii="Times New Roman" w:eastAsia="Times New Roman" w:hAnsi="Times New Roman"/>
-          <w:color w:val="000000"/>
-          <w:sz w:val="28"/>
-          <w:szCs w:val="28"/>
-          <w:lang w:eastAsia="ru-RU"/>
+          <w:rFonts w:ascii="Times New Roman" w:hAnsi="Times New Roman" w:eastAsia="Times New Roman" w:cs="Times New Roman"/>
+          <w:color w:val="000000"/>
+          <w:sz w:val="28"/>
+          <w:szCs w:val="28"/>
+          <w:lang w:val="ru-RU" w:eastAsia="ru-RU" w:bidi="ar-SA"/>
+          <w:highlight w:val="white"/>
         </w:rPr>
         <w:t>1.        Чтение данных из файла</w:t>
       </w:r>
     </w:p>
     <w:p>
       <w:pPr>
-        <w:shd w:val="clear" w:color="auto" w:fill="FFFFFF"/>
+        <w:shd w:color="auto" w:fill="FFFFFF" w:val="clear"/>
         <w:tabs>
           <w:tab w:val="left" w:pos="916"/>
           <w:tab w:val="left" w:pos="1832"/>
@@ -336,7 +354,7 @@
         <w:spacing w:after="0" w:line="240" w:lineRule="auto"/>
         <w:jc w:val="both"/>
         <w:rPr>
-          <w:rFonts w:ascii="Times New Roman" w:eastAsia="Times New Roman" w:hAnsi="Times New Roman"/>
+          <w:rFonts w:ascii="Times New Roman" w:hAnsi="Times New Roman" w:eastAsia="Times New Roman"/>
           <w:color w:val="000000"/>
           <w:sz w:val="28"/>
           <w:szCs w:val="28"/>
@@ -345,38 +363,41 @@
       </w:pPr>
       <w:r>
         <w:rPr>
-          <w:rFonts w:ascii="Times New Roman" w:eastAsia="Times New Roman" w:hAnsi="Times New Roman"/>
-          <w:color w:val="000000"/>
-          <w:sz w:val="28"/>
-          <w:szCs w:val="28"/>
-          <w:lang w:eastAsia="ru-RU"/>
+          <w:rFonts w:ascii="Times New Roman" w:hAnsi="Times New Roman" w:eastAsia="Times New Roman" w:cs="Times New Roman"/>
+          <w:color w:val="000000"/>
+          <w:sz w:val="28"/>
+          <w:szCs w:val="28"/>
+          <w:lang w:val="ru-RU" w:eastAsia="ru-RU" w:bidi="ar-SA"/>
+          <w:highlight w:val="white"/>
         </w:rPr>
         <w:t>2.        Просмотр всего списка (если несколько списков – выпадает подменю с</w:t>
       </w:r>
       <w:r>
         <w:rPr>
-          <w:rFonts w:ascii="Times New Roman" w:eastAsia="Times New Roman" w:hAnsi="Times New Roman"/>
-          <w:color w:val="000000"/>
-          <w:sz w:val="28"/>
-          <w:szCs w:val="28"/>
-          <w:lang w:eastAsia="ru-RU"/>
+          <w:rFonts w:ascii="Times New Roman" w:hAnsi="Times New Roman" w:eastAsia="Times New Roman" w:cs="Times New Roman"/>
+          <w:color w:val="000000"/>
+          <w:sz w:val="28"/>
+          <w:szCs w:val="28"/>
+          <w:lang w:val="ru-RU" w:eastAsia="ru-RU" w:bidi="ar-SA"/>
+          <w:highlight w:val="white"/>
         </w:rPr>
         <w:t xml:space="preserve"> </w:t>
       </w:r>
       <w:r>
         <w:rPr>
-          <w:rFonts w:ascii="Times New Roman" w:eastAsia="Times New Roman" w:hAnsi="Times New Roman"/>
-          <w:color w:val="000000"/>
-          <w:sz w:val="28"/>
-          <w:szCs w:val="28"/>
-          <w:lang w:eastAsia="ru-RU"/>
+          <w:rFonts w:ascii="Times New Roman" w:hAnsi="Times New Roman" w:eastAsia="Times New Roman" w:cs="Times New Roman"/>
+          <w:color w:val="000000"/>
+          <w:sz w:val="28"/>
+          <w:szCs w:val="28"/>
+          <w:lang w:val="ru-RU" w:eastAsia="ru-RU" w:bidi="ar-SA"/>
+          <w:highlight w:val="white"/>
         </w:rPr>
         <w:t>именами списков для просмотра)</w:t>
       </w:r>
     </w:p>
     <w:p>
       <w:pPr>
-        <w:shd w:val="clear" w:color="auto" w:fill="FFFFFF"/>
+        <w:shd w:color="auto" w:fill="FFFFFF" w:val="clear"/>
         <w:tabs>
           <w:tab w:val="left" w:pos="916"/>
           <w:tab w:val="left" w:pos="1832"/>
@@ -398,7 +419,7 @@
         <w:spacing w:after="0" w:line="240" w:lineRule="auto"/>
         <w:jc w:val="both"/>
         <w:rPr>
-          <w:rFonts w:ascii="Times New Roman" w:eastAsia="Times New Roman" w:hAnsi="Times New Roman"/>
+          <w:rFonts w:ascii="Times New Roman" w:hAnsi="Times New Roman" w:eastAsia="Times New Roman"/>
           <w:color w:val="000000"/>
           <w:sz w:val="28"/>
           <w:szCs w:val="28"/>
@@ -407,18 +428,19 @@
       </w:pPr>
       <w:r>
         <w:rPr>
-          <w:rFonts w:ascii="Times New Roman" w:eastAsia="Times New Roman" w:hAnsi="Times New Roman"/>
-          <w:color w:val="000000"/>
-          <w:sz w:val="28"/>
-          <w:szCs w:val="28"/>
-          <w:lang w:eastAsia="ru-RU"/>
+          <w:rFonts w:ascii="Times New Roman" w:hAnsi="Times New Roman" w:eastAsia="Times New Roman" w:cs="Times New Roman"/>
+          <w:color w:val="000000"/>
+          <w:sz w:val="28"/>
+          <w:szCs w:val="28"/>
+          <w:lang w:val="ru-RU" w:eastAsia="ru-RU" w:bidi="ar-SA"/>
+          <w:highlight w:val="white"/>
         </w:rPr>
         <w:t>3.        Сортировка данных в соответствии с заданием</w:t>
       </w:r>
     </w:p>
     <w:p>
       <w:pPr>
-        <w:shd w:val="clear" w:color="auto" w:fill="FFFFFF"/>
+        <w:shd w:color="auto" w:fill="FFFFFF" w:val="clear"/>
         <w:tabs>
           <w:tab w:val="left" w:pos="916"/>
           <w:tab w:val="left" w:pos="1832"/>
@@ -440,7 +462,7 @@
         <w:spacing w:after="0" w:line="240" w:lineRule="auto"/>
         <w:jc w:val="both"/>
         <w:rPr>
-          <w:rFonts w:ascii="Times New Roman" w:eastAsia="Times New Roman" w:hAnsi="Times New Roman"/>
+          <w:rFonts w:ascii="Times New Roman" w:hAnsi="Times New Roman" w:eastAsia="Times New Roman"/>
           <w:color w:val="000000"/>
           <w:sz w:val="28"/>
           <w:szCs w:val="28"/>
@@ -449,18 +471,19 @@
       </w:pPr>
       <w:r>
         <w:rPr>
-          <w:rFonts w:ascii="Times New Roman" w:eastAsia="Times New Roman" w:hAnsi="Times New Roman"/>
-          <w:color w:val="000000"/>
-          <w:sz w:val="28"/>
-          <w:szCs w:val="28"/>
-          <w:lang w:eastAsia="ru-RU"/>
+          <w:rFonts w:ascii="Times New Roman" w:hAnsi="Times New Roman" w:eastAsia="Times New Roman" w:cs="Times New Roman"/>
+          <w:color w:val="000000"/>
+          <w:sz w:val="28"/>
+          <w:szCs w:val="28"/>
+          <w:lang w:val="ru-RU" w:eastAsia="ru-RU" w:bidi="ar-SA"/>
+          <w:highlight w:val="white"/>
         </w:rPr>
         <w:t>4.        Поиск данных с использованием фильтров</w:t>
       </w:r>
     </w:p>
     <w:p>
       <w:pPr>
-        <w:shd w:val="clear" w:color="auto" w:fill="FFFFFF"/>
+        <w:shd w:color="auto" w:fill="FFFFFF" w:val="clear"/>
         <w:tabs>
           <w:tab w:val="left" w:pos="916"/>
           <w:tab w:val="left" w:pos="1832"/>
@@ -482,7 +505,7 @@
         <w:spacing w:after="0" w:line="240" w:lineRule="auto"/>
         <w:jc w:val="both"/>
         <w:rPr>
-          <w:rFonts w:ascii="Times New Roman" w:eastAsia="Times New Roman" w:hAnsi="Times New Roman"/>
+          <w:rFonts w:ascii="Times New Roman" w:hAnsi="Times New Roman" w:eastAsia="Times New Roman"/>
           <w:color w:val="000000"/>
           <w:sz w:val="28"/>
           <w:szCs w:val="28"/>
@@ -491,38 +514,41 @@
       </w:pPr>
       <w:r>
         <w:rPr>
-          <w:rFonts w:ascii="Times New Roman" w:eastAsia="Times New Roman" w:hAnsi="Times New Roman"/>
-          <w:color w:val="000000"/>
-          <w:sz w:val="28"/>
-          <w:szCs w:val="28"/>
-          <w:lang w:eastAsia="ru-RU"/>
+          <w:rFonts w:ascii="Times New Roman" w:hAnsi="Times New Roman" w:eastAsia="Times New Roman" w:cs="Times New Roman"/>
+          <w:color w:val="000000"/>
+          <w:sz w:val="28"/>
+          <w:szCs w:val="28"/>
+          <w:lang w:val="ru-RU" w:eastAsia="ru-RU" w:bidi="ar-SA"/>
+          <w:highlight w:val="white"/>
         </w:rPr>
         <w:t>5.        Добавление данных в список (если несколько списков – выпадает</w:t>
       </w:r>
       <w:r>
         <w:rPr>
-          <w:rFonts w:ascii="Times New Roman" w:eastAsia="Times New Roman" w:hAnsi="Times New Roman"/>
-          <w:color w:val="000000"/>
-          <w:sz w:val="28"/>
-          <w:szCs w:val="28"/>
-          <w:lang w:eastAsia="ru-RU"/>
+          <w:rFonts w:ascii="Times New Roman" w:hAnsi="Times New Roman" w:eastAsia="Times New Roman" w:cs="Times New Roman"/>
+          <w:color w:val="000000"/>
+          <w:sz w:val="28"/>
+          <w:szCs w:val="28"/>
+          <w:lang w:val="ru-RU" w:eastAsia="ru-RU" w:bidi="ar-SA"/>
+          <w:highlight w:val="white"/>
         </w:rPr>
         <w:t xml:space="preserve"> </w:t>
       </w:r>
       <w:r>
         <w:rPr>
-          <w:rFonts w:ascii="Times New Roman" w:eastAsia="Times New Roman" w:hAnsi="Times New Roman"/>
-          <w:color w:val="000000"/>
-          <w:sz w:val="28"/>
-          <w:szCs w:val="28"/>
-          <w:lang w:eastAsia="ru-RU"/>
+          <w:rFonts w:ascii="Times New Roman" w:hAnsi="Times New Roman" w:eastAsia="Times New Roman" w:cs="Times New Roman"/>
+          <w:color w:val="000000"/>
+          <w:sz w:val="28"/>
+          <w:szCs w:val="28"/>
+          <w:lang w:val="ru-RU" w:eastAsia="ru-RU" w:bidi="ar-SA"/>
+          <w:highlight w:val="white"/>
         </w:rPr>
         <w:t>подменю с именами списков для добавления)</w:t>
       </w:r>
     </w:p>
     <w:p>
       <w:pPr>
-        <w:shd w:val="clear" w:color="auto" w:fill="FFFFFF"/>
+        <w:shd w:color="auto" w:fill="FFFFFF" w:val="clear"/>
         <w:tabs>
           <w:tab w:val="left" w:pos="916"/>
           <w:tab w:val="left" w:pos="1832"/>
@@ -544,7 +570,7 @@
         <w:spacing w:after="0" w:line="240" w:lineRule="auto"/>
         <w:jc w:val="both"/>
         <w:rPr>
-          <w:rFonts w:ascii="Times New Roman" w:eastAsia="Times New Roman" w:hAnsi="Times New Roman"/>
+          <w:rFonts w:ascii="Times New Roman" w:hAnsi="Times New Roman" w:eastAsia="Times New Roman"/>
           <w:color w:val="000000"/>
           <w:sz w:val="28"/>
           <w:szCs w:val="28"/>
@@ -553,38 +579,41 @@
       </w:pPr>
       <w:r>
         <w:rPr>
-          <w:rFonts w:ascii="Times New Roman" w:eastAsia="Times New Roman" w:hAnsi="Times New Roman"/>
-          <w:color w:val="000000"/>
-          <w:sz w:val="28"/>
-          <w:szCs w:val="28"/>
-          <w:lang w:eastAsia="ru-RU"/>
+          <w:rFonts w:ascii="Times New Roman" w:hAnsi="Times New Roman" w:eastAsia="Times New Roman" w:cs="Times New Roman"/>
+          <w:color w:val="000000"/>
+          <w:sz w:val="28"/>
+          <w:szCs w:val="28"/>
+          <w:lang w:val="ru-RU" w:eastAsia="ru-RU" w:bidi="ar-SA"/>
+          <w:highlight w:val="white"/>
         </w:rPr>
         <w:t>6.        Удаление данных из списка (если несколько списков – выпадает</w:t>
       </w:r>
       <w:r>
         <w:rPr>
-          <w:rFonts w:ascii="Times New Roman" w:eastAsia="Times New Roman" w:hAnsi="Times New Roman"/>
-          <w:color w:val="000000"/>
-          <w:sz w:val="28"/>
-          <w:szCs w:val="28"/>
-          <w:lang w:eastAsia="ru-RU"/>
+          <w:rFonts w:ascii="Times New Roman" w:hAnsi="Times New Roman" w:eastAsia="Times New Roman" w:cs="Times New Roman"/>
+          <w:color w:val="000000"/>
+          <w:sz w:val="28"/>
+          <w:szCs w:val="28"/>
+          <w:lang w:val="ru-RU" w:eastAsia="ru-RU" w:bidi="ar-SA"/>
+          <w:highlight w:val="white"/>
         </w:rPr>
         <w:t xml:space="preserve"> </w:t>
       </w:r>
       <w:r>
         <w:rPr>
-          <w:rFonts w:ascii="Times New Roman" w:eastAsia="Times New Roman" w:hAnsi="Times New Roman"/>
-          <w:color w:val="000000"/>
-          <w:sz w:val="28"/>
-          <w:szCs w:val="28"/>
-          <w:lang w:eastAsia="ru-RU"/>
+          <w:rFonts w:ascii="Times New Roman" w:hAnsi="Times New Roman" w:eastAsia="Times New Roman" w:cs="Times New Roman"/>
+          <w:color w:val="000000"/>
+          <w:sz w:val="28"/>
+          <w:szCs w:val="28"/>
+          <w:lang w:val="ru-RU" w:eastAsia="ru-RU" w:bidi="ar-SA"/>
+          <w:highlight w:val="white"/>
         </w:rPr>
         <w:t>подменю с именами списков для удаления)</w:t>
       </w:r>
     </w:p>
     <w:p>
       <w:pPr>
-        <w:shd w:val="clear" w:color="auto" w:fill="FFFFFF"/>
+        <w:shd w:color="auto" w:fill="FFFFFF" w:val="clear"/>
         <w:tabs>
           <w:tab w:val="left" w:pos="916"/>
           <w:tab w:val="left" w:pos="1832"/>
@@ -606,7 +635,7 @@
         <w:spacing w:after="0" w:line="240" w:lineRule="auto"/>
         <w:jc w:val="both"/>
         <w:rPr>
-          <w:rFonts w:ascii="Times New Roman" w:eastAsia="Times New Roman" w:hAnsi="Times New Roman"/>
+          <w:rFonts w:ascii="Times New Roman" w:hAnsi="Times New Roman" w:eastAsia="Times New Roman"/>
           <w:color w:val="000000"/>
           <w:sz w:val="28"/>
           <w:szCs w:val="28"/>
@@ -615,38 +644,41 @@
       </w:pPr>
       <w:r>
         <w:rPr>
-          <w:rFonts w:ascii="Times New Roman" w:eastAsia="Times New Roman" w:hAnsi="Times New Roman"/>
-          <w:color w:val="000000"/>
-          <w:sz w:val="28"/>
-          <w:szCs w:val="28"/>
-          <w:lang w:eastAsia="ru-RU"/>
+          <w:rFonts w:ascii="Times New Roman" w:hAnsi="Times New Roman" w:eastAsia="Times New Roman" w:cs="Times New Roman"/>
+          <w:color w:val="000000"/>
+          <w:sz w:val="28"/>
+          <w:szCs w:val="28"/>
+          <w:lang w:val="ru-RU" w:eastAsia="ru-RU" w:bidi="ar-SA"/>
+          <w:highlight w:val="white"/>
         </w:rPr>
         <w:t>7.        Редактирование данных (если несколько списков – выпадает подменю с</w:t>
       </w:r>
       <w:r>
         <w:rPr>
-          <w:rFonts w:ascii="Times New Roman" w:eastAsia="Times New Roman" w:hAnsi="Times New Roman"/>
-          <w:color w:val="000000"/>
-          <w:sz w:val="28"/>
-          <w:szCs w:val="28"/>
-          <w:lang w:eastAsia="ru-RU"/>
+          <w:rFonts w:ascii="Times New Roman" w:hAnsi="Times New Roman" w:eastAsia="Times New Roman" w:cs="Times New Roman"/>
+          <w:color w:val="000000"/>
+          <w:sz w:val="28"/>
+          <w:szCs w:val="28"/>
+          <w:lang w:val="ru-RU" w:eastAsia="ru-RU" w:bidi="ar-SA"/>
+          <w:highlight w:val="white"/>
         </w:rPr>
         <w:t xml:space="preserve"> </w:t>
       </w:r>
       <w:r>
         <w:rPr>
-          <w:rFonts w:ascii="Times New Roman" w:eastAsia="Times New Roman" w:hAnsi="Times New Roman"/>
-          <w:color w:val="000000"/>
-          <w:sz w:val="28"/>
-          <w:szCs w:val="28"/>
-          <w:lang w:eastAsia="ru-RU"/>
+          <w:rFonts w:ascii="Times New Roman" w:hAnsi="Times New Roman" w:eastAsia="Times New Roman" w:cs="Times New Roman"/>
+          <w:color w:val="000000"/>
+          <w:sz w:val="28"/>
+          <w:szCs w:val="28"/>
+          <w:lang w:val="ru-RU" w:eastAsia="ru-RU" w:bidi="ar-SA"/>
+          <w:highlight w:val="white"/>
         </w:rPr>
         <w:t>именами списков для редактирования)</w:t>
       </w:r>
     </w:p>
     <w:p>
       <w:pPr>
-        <w:shd w:val="clear" w:color="auto" w:fill="FFFFFF"/>
+        <w:shd w:color="auto" w:fill="FFFFFF" w:val="clear"/>
         <w:tabs>
           <w:tab w:val="left" w:pos="916"/>
           <w:tab w:val="left" w:pos="1832"/>
@@ -668,7 +700,7 @@
         <w:spacing w:after="0" w:line="240" w:lineRule="auto"/>
         <w:jc w:val="both"/>
         <w:rPr>
-          <w:rFonts w:ascii="Times New Roman" w:eastAsia="Times New Roman" w:hAnsi="Times New Roman"/>
+          <w:rFonts w:ascii="Times New Roman" w:hAnsi="Times New Roman" w:eastAsia="Times New Roman"/>
           <w:color w:val="000000"/>
           <w:sz w:val="28"/>
           <w:szCs w:val="28"/>
@@ -677,58 +709,63 @@
       </w:pPr>
       <w:r>
         <w:rPr>
-          <w:rFonts w:ascii="Times New Roman" w:eastAsia="Times New Roman" w:hAnsi="Times New Roman"/>
-          <w:color w:val="000000"/>
-          <w:sz w:val="28"/>
-          <w:szCs w:val="28"/>
-          <w:lang w:eastAsia="ru-RU"/>
+          <w:rFonts w:ascii="Times New Roman" w:hAnsi="Times New Roman" w:eastAsia="Times New Roman" w:cs="Times New Roman"/>
+          <w:color w:val="000000"/>
+          <w:sz w:val="28"/>
+          <w:szCs w:val="28"/>
+          <w:lang w:val="ru-RU" w:eastAsia="ru-RU" w:bidi="ar-SA"/>
+          <w:highlight w:val="white"/>
         </w:rPr>
         <w:t>8.        Специальные функции задания. Специальные функции –позиции</w:t>
       </w:r>
       <w:r>
         <w:rPr>
-          <w:rFonts w:ascii="Times New Roman" w:eastAsia="Times New Roman" w:hAnsi="Times New Roman"/>
-          <w:color w:val="000000"/>
-          <w:sz w:val="28"/>
-          <w:szCs w:val="28"/>
-          <w:lang w:eastAsia="ru-RU"/>
+          <w:rFonts w:ascii="Times New Roman" w:hAnsi="Times New Roman" w:eastAsia="Times New Roman" w:cs="Times New Roman"/>
+          <w:color w:val="000000"/>
+          <w:sz w:val="28"/>
+          <w:szCs w:val="28"/>
+          <w:lang w:val="ru-RU" w:eastAsia="ru-RU" w:bidi="ar-SA"/>
+          <w:highlight w:val="white"/>
         </w:rPr>
         <w:t xml:space="preserve"> </w:t>
       </w:r>
       <w:r>
         <w:rPr>
-          <w:rFonts w:ascii="Times New Roman" w:eastAsia="Times New Roman" w:hAnsi="Times New Roman"/>
-          <w:color w:val="000000"/>
-          <w:sz w:val="28"/>
-          <w:szCs w:val="28"/>
-          <w:lang w:eastAsia="ru-RU"/>
+          <w:rFonts w:ascii="Times New Roman" w:hAnsi="Times New Roman" w:eastAsia="Times New Roman" w:cs="Times New Roman"/>
+          <w:color w:val="000000"/>
+          <w:sz w:val="28"/>
+          <w:szCs w:val="28"/>
+          <w:lang w:val="ru-RU" w:eastAsia="ru-RU" w:bidi="ar-SA"/>
+          <w:highlight w:val="white"/>
         </w:rPr>
         <w:t>ненумерованного списка в варианте задания, помеченные литерами (СФ). (если</w:t>
       </w:r>
       <w:r>
         <w:rPr>
-          <w:rFonts w:ascii="Times New Roman" w:eastAsia="Times New Roman" w:hAnsi="Times New Roman"/>
-          <w:color w:val="000000"/>
-          <w:sz w:val="28"/>
-          <w:szCs w:val="28"/>
-          <w:lang w:eastAsia="ru-RU"/>
+          <w:rFonts w:ascii="Times New Roman" w:hAnsi="Times New Roman" w:eastAsia="Times New Roman" w:cs="Times New Roman"/>
+          <w:color w:val="000000"/>
+          <w:sz w:val="28"/>
+          <w:szCs w:val="28"/>
+          <w:lang w:val="ru-RU" w:eastAsia="ru-RU" w:bidi="ar-SA"/>
+          <w:highlight w:val="white"/>
         </w:rPr>
         <w:t xml:space="preserve"> </w:t>
       </w:r>
       <w:r>
         <w:rPr>
-          <w:rFonts w:ascii="Times New Roman" w:eastAsia="Times New Roman" w:hAnsi="Times New Roman"/>
-          <w:color w:val="000000"/>
-          <w:sz w:val="28"/>
-          <w:szCs w:val="28"/>
-          <w:lang w:eastAsia="ru-RU"/>
+          <w:rFonts w:ascii="Times New Roman" w:hAnsi="Times New Roman" w:eastAsia="Times New Roman" w:cs="Times New Roman"/>
+          <w:color w:val="000000"/>
+          <w:sz w:val="28"/>
+          <w:szCs w:val="28"/>
+          <w:lang w:val="ru-RU" w:eastAsia="ru-RU" w:bidi="ar-SA"/>
+          <w:highlight w:val="white"/>
         </w:rPr>
         <w:t>таких функций несколько – выпадает подменю с именами специальных функций)</w:t>
       </w:r>
     </w:p>
     <w:p>
       <w:pPr>
-        <w:shd w:val="clear" w:color="auto" w:fill="FFFFFF"/>
+        <w:shd w:color="auto" w:fill="FFFFFF" w:val="clear"/>
         <w:tabs>
           <w:tab w:val="left" w:pos="916"/>
           <w:tab w:val="left" w:pos="1832"/>
@@ -750,7 +787,7 @@
         <w:spacing w:after="0" w:line="240" w:lineRule="auto"/>
         <w:jc w:val="both"/>
         <w:rPr>
-          <w:rFonts w:ascii="Times New Roman" w:eastAsia="Times New Roman" w:hAnsi="Times New Roman"/>
+          <w:rFonts w:ascii="Times New Roman" w:hAnsi="Times New Roman" w:eastAsia="Times New Roman"/>
           <w:color w:val="000000"/>
           <w:sz w:val="28"/>
           <w:szCs w:val="28"/>
@@ -759,38 +796,41 @@
       </w:pPr>
       <w:r>
         <w:rPr>
-          <w:rFonts w:ascii="Times New Roman" w:eastAsia="Times New Roman" w:hAnsi="Times New Roman"/>
-          <w:color w:val="000000"/>
-          <w:sz w:val="28"/>
-          <w:szCs w:val="28"/>
-          <w:lang w:eastAsia="ru-RU"/>
+          <w:rFonts w:ascii="Times New Roman" w:hAnsi="Times New Roman" w:eastAsia="Times New Roman" w:cs="Times New Roman"/>
+          <w:color w:val="000000"/>
+          <w:sz w:val="28"/>
+          <w:szCs w:val="28"/>
+          <w:lang w:val="ru-RU" w:eastAsia="ru-RU" w:bidi="ar-SA"/>
+          <w:highlight w:val="white"/>
         </w:rPr>
         <w:t>ЭТОТ ПУНКТ МЕНЮ НАДО ОБЯЗАТЕЛЬНО ПЕРЕНАЗВАТЬ В СООТВЕТСТВИИ СО ЗНАЧЕНИЕМ</w:t>
       </w:r>
       <w:r>
         <w:rPr>
-          <w:rFonts w:ascii="Times New Roman" w:eastAsia="Times New Roman" w:hAnsi="Times New Roman"/>
-          <w:color w:val="000000"/>
-          <w:sz w:val="28"/>
-          <w:szCs w:val="28"/>
-          <w:lang w:eastAsia="ru-RU"/>
+          <w:rFonts w:ascii="Times New Roman" w:hAnsi="Times New Roman" w:eastAsia="Times New Roman" w:cs="Times New Roman"/>
+          <w:color w:val="000000"/>
+          <w:sz w:val="28"/>
+          <w:szCs w:val="28"/>
+          <w:lang w:val="ru-RU" w:eastAsia="ru-RU" w:bidi="ar-SA"/>
+          <w:highlight w:val="white"/>
         </w:rPr>
         <w:t xml:space="preserve"> </w:t>
       </w:r>
       <w:r>
         <w:rPr>
-          <w:rFonts w:ascii="Times New Roman" w:eastAsia="Times New Roman" w:hAnsi="Times New Roman"/>
-          <w:color w:val="000000"/>
-          <w:sz w:val="28"/>
-          <w:szCs w:val="28"/>
-          <w:lang w:eastAsia="ru-RU"/>
+          <w:rFonts w:ascii="Times New Roman" w:hAnsi="Times New Roman" w:eastAsia="Times New Roman" w:cs="Times New Roman"/>
+          <w:color w:val="000000"/>
+          <w:sz w:val="28"/>
+          <w:szCs w:val="28"/>
+          <w:lang w:val="ru-RU" w:eastAsia="ru-RU" w:bidi="ar-SA"/>
+          <w:highlight w:val="white"/>
         </w:rPr>
         <w:t>ВЫДАВАЕМЫХ ФУНКЦИЯМИ ДАННЫХ</w:t>
       </w:r>
     </w:p>
     <w:p>
       <w:pPr>
-        <w:shd w:val="clear" w:color="auto" w:fill="FFFFFF"/>
+        <w:shd w:color="auto" w:fill="FFFFFF" w:val="clear"/>
         <w:tabs>
           <w:tab w:val="left" w:pos="916"/>
           <w:tab w:val="left" w:pos="1832"/>
@@ -812,7 +852,7 @@
         <w:spacing w:after="0" w:line="240" w:lineRule="auto"/>
         <w:jc w:val="both"/>
         <w:rPr>
-          <w:rFonts w:ascii="Times New Roman" w:eastAsia="Times New Roman" w:hAnsi="Times New Roman"/>
+          <w:rFonts w:ascii="Times New Roman" w:hAnsi="Times New Roman" w:eastAsia="Times New Roman"/>
           <w:color w:val="000000"/>
           <w:sz w:val="28"/>
           <w:szCs w:val="28"/>
@@ -821,18 +861,19 @@
       </w:pPr>
       <w:r>
         <w:rPr>
-          <w:rFonts w:ascii="Times New Roman" w:eastAsia="Times New Roman" w:hAnsi="Times New Roman"/>
-          <w:color w:val="000000"/>
-          <w:sz w:val="28"/>
-          <w:szCs w:val="28"/>
-          <w:lang w:eastAsia="ru-RU"/>
+          <w:rFonts w:ascii="Times New Roman" w:hAnsi="Times New Roman" w:eastAsia="Times New Roman" w:cs="Times New Roman"/>
+          <w:color w:val="000000"/>
+          <w:sz w:val="28"/>
+          <w:szCs w:val="28"/>
+          <w:lang w:val="ru-RU" w:eastAsia="ru-RU" w:bidi="ar-SA"/>
+          <w:highlight w:val="white"/>
         </w:rPr>
         <w:t>9.        Выход из программы без сохранения изменений</w:t>
       </w:r>
     </w:p>
     <w:p>
       <w:pPr>
-        <w:shd w:val="clear" w:color="auto" w:fill="FFFFFF"/>
+        <w:shd w:color="auto" w:fill="FFFFFF" w:val="clear"/>
         <w:tabs>
           <w:tab w:val="left" w:pos="916"/>
           <w:tab w:val="left" w:pos="1832"/>
@@ -854,7 +895,7 @@
         <w:spacing w:after="0" w:line="240" w:lineRule="auto"/>
         <w:jc w:val="both"/>
         <w:rPr>
-          <w:rFonts w:ascii="Times New Roman" w:eastAsia="Times New Roman" w:hAnsi="Times New Roman"/>
+          <w:rFonts w:ascii="Times New Roman" w:hAnsi="Times New Roman" w:eastAsia="Times New Roman"/>
           <w:color w:val="000000"/>
           <w:sz w:val="28"/>
           <w:szCs w:val="28"/>
@@ -863,18 +904,19 @@
       </w:pPr>
       <w:r>
         <w:rPr>
-          <w:rFonts w:ascii="Times New Roman" w:eastAsia="Times New Roman" w:hAnsi="Times New Roman"/>
-          <w:color w:val="000000"/>
-          <w:sz w:val="28"/>
-          <w:szCs w:val="28"/>
-          <w:lang w:eastAsia="ru-RU"/>
+          <w:rFonts w:ascii="Times New Roman" w:hAnsi="Times New Roman" w:eastAsia="Times New Roman" w:cs="Times New Roman"/>
+          <w:color w:val="000000"/>
+          <w:sz w:val="28"/>
+          <w:szCs w:val="28"/>
+          <w:lang w:val="ru-RU" w:eastAsia="ru-RU" w:bidi="ar-SA"/>
+          <w:highlight w:val="white"/>
         </w:rPr>
         <w:t>10.        Выход с сохранением изменений</w:t>
       </w:r>
     </w:p>
     <w:p>
       <w:pPr>
-        <w:shd w:val="clear" w:color="auto" w:fill="FFFFFF"/>
+        <w:shd w:color="auto" w:fill="FFFFFF" w:val="clear"/>
         <w:tabs>
           <w:tab w:val="left" w:pos="916"/>
           <w:tab w:val="left" w:pos="1832"/>
@@ -896,7 +938,7 @@
         <w:spacing w:after="0" w:line="240" w:lineRule="auto"/>
         <w:jc w:val="both"/>
         <w:rPr>
-          <w:rFonts w:ascii="Times New Roman" w:eastAsia="Times New Roman" w:hAnsi="Times New Roman"/>
+          <w:rFonts w:ascii="Times New Roman" w:hAnsi="Times New Roman" w:eastAsia="Times New Roman"/>
           <w:color w:val="000000"/>
           <w:sz w:val="28"/>
           <w:szCs w:val="28"/>
@@ -905,58 +947,63 @@
       </w:pPr>
       <w:r>
         <w:rPr>
-          <w:rFonts w:ascii="Times New Roman" w:eastAsia="Times New Roman" w:hAnsi="Times New Roman"/>
-          <w:color w:val="000000"/>
-          <w:sz w:val="28"/>
-          <w:szCs w:val="28"/>
-          <w:lang w:eastAsia="ru-RU"/>
+          <w:rFonts w:ascii="Times New Roman" w:hAnsi="Times New Roman" w:eastAsia="Times New Roman" w:cs="Times New Roman"/>
+          <w:color w:val="000000"/>
+          <w:sz w:val="28"/>
+          <w:szCs w:val="28"/>
+          <w:lang w:val="ru-RU" w:eastAsia="ru-RU" w:bidi="ar-SA"/>
+          <w:highlight w:val="white"/>
         </w:rPr>
         <w:t>При реализации пункта 8 меню, полученные данные должны выводиться на экран</w:t>
       </w:r>
       <w:r>
         <w:rPr>
-          <w:rFonts w:ascii="Times New Roman" w:eastAsia="Times New Roman" w:hAnsi="Times New Roman"/>
-          <w:color w:val="000000"/>
-          <w:sz w:val="28"/>
-          <w:szCs w:val="28"/>
-          <w:lang w:eastAsia="ru-RU"/>
+          <w:rFonts w:ascii="Times New Roman" w:hAnsi="Times New Roman" w:eastAsia="Times New Roman" w:cs="Times New Roman"/>
+          <w:color w:val="000000"/>
+          <w:sz w:val="28"/>
+          <w:szCs w:val="28"/>
+          <w:lang w:val="ru-RU" w:eastAsia="ru-RU" w:bidi="ar-SA"/>
+          <w:highlight w:val="white"/>
         </w:rPr>
         <w:t xml:space="preserve"> </w:t>
       </w:r>
       <w:r>
         <w:rPr>
-          <w:rFonts w:ascii="Times New Roman" w:eastAsia="Times New Roman" w:hAnsi="Times New Roman"/>
-          <w:color w:val="000000"/>
-          <w:sz w:val="28"/>
-          <w:szCs w:val="28"/>
-          <w:lang w:eastAsia="ru-RU"/>
+          <w:rFonts w:ascii="Times New Roman" w:hAnsi="Times New Roman" w:eastAsia="Times New Roman" w:cs="Times New Roman"/>
+          <w:color w:val="000000"/>
+          <w:sz w:val="28"/>
+          <w:szCs w:val="28"/>
+          <w:lang w:val="ru-RU" w:eastAsia="ru-RU" w:bidi="ar-SA"/>
+          <w:highlight w:val="white"/>
         </w:rPr>
         <w:t>и записываться в текстовый файл. Если специальных функций несколько, то и</w:t>
       </w:r>
       <w:r>
         <w:rPr>
-          <w:rFonts w:ascii="Times New Roman" w:eastAsia="Times New Roman" w:hAnsi="Times New Roman"/>
-          <w:color w:val="000000"/>
-          <w:sz w:val="28"/>
-          <w:szCs w:val="28"/>
-          <w:lang w:eastAsia="ru-RU"/>
+          <w:rFonts w:ascii="Times New Roman" w:hAnsi="Times New Roman" w:eastAsia="Times New Roman" w:cs="Times New Roman"/>
+          <w:color w:val="000000"/>
+          <w:sz w:val="28"/>
+          <w:szCs w:val="28"/>
+          <w:lang w:val="ru-RU" w:eastAsia="ru-RU" w:bidi="ar-SA"/>
+          <w:highlight w:val="white"/>
         </w:rPr>
         <w:t xml:space="preserve"> </w:t>
       </w:r>
       <w:r>
         <w:rPr>
-          <w:rFonts w:ascii="Times New Roman" w:eastAsia="Times New Roman" w:hAnsi="Times New Roman"/>
-          <w:color w:val="000000"/>
-          <w:sz w:val="28"/>
-          <w:szCs w:val="28"/>
-          <w:lang w:eastAsia="ru-RU"/>
+          <w:rFonts w:ascii="Times New Roman" w:hAnsi="Times New Roman" w:eastAsia="Times New Roman" w:cs="Times New Roman"/>
+          <w:color w:val="000000"/>
+          <w:sz w:val="28"/>
+          <w:szCs w:val="28"/>
+          <w:lang w:val="ru-RU" w:eastAsia="ru-RU" w:bidi="ar-SA"/>
+          <w:highlight w:val="white"/>
         </w:rPr>
         <w:t>текстовых файлов будет несколько.</w:t>
       </w:r>
     </w:p>
     <w:p>
       <w:pPr>
-        <w:shd w:val="clear" w:color="auto" w:fill="FFFFFF"/>
+        <w:shd w:color="auto" w:fill="FFFFFF" w:val="clear"/>
         <w:tabs>
           <w:tab w:val="left" w:pos="916"/>
           <w:tab w:val="left" w:pos="1832"/>
@@ -978,7 +1025,7 @@
         <w:spacing w:after="0" w:line="240" w:lineRule="auto"/>
         <w:jc w:val="both"/>
         <w:rPr>
-          <w:rFonts w:ascii="Times New Roman" w:eastAsia="Times New Roman" w:hAnsi="Times New Roman"/>
+          <w:rFonts w:ascii="Times New Roman" w:hAnsi="Times New Roman" w:eastAsia="Times New Roman"/>
           <w:color w:val="000000"/>
           <w:sz w:val="28"/>
           <w:szCs w:val="28"/>
@@ -997,7 +1044,7 @@
       </w:pPr>
       <w:r>
         <w:rPr>
-          <w:rFonts w:ascii="Times New Roman" w:hAnsi="Times New Roman"/>
+          <w:rFonts w:ascii="Times New Roman" w:hAnsi="Times New Roman" w:eastAsia="Times New Roman" w:cs="Times New Roman"/>
           <w:sz w:val="28"/>
           <w:szCs w:val="28"/>
         </w:rPr>
@@ -1005,7 +1052,7 @@
       </w:r>
       <w:r>
         <w:rPr>
-          <w:rFonts w:ascii="Times New Roman" w:hAnsi="Times New Roman"/>
+          <w:rFonts w:ascii="Times New Roman" w:hAnsi="Times New Roman" w:eastAsia="Times New Roman" w:cs="Times New Roman"/>
           <w:sz w:val="28"/>
           <w:szCs w:val="28"/>
         </w:rPr>
@@ -1016,7 +1063,7 @@
       <w:pPr>
         <w:pStyle w:val="a3"/>
         <w:spacing w:before="120"/>
-        <w:ind w:left="0" w:firstLine="0"/>
+        <w:ind w:firstLine="0" w:left="0"/>
         <w:jc w:val="both"/>
         <w:rPr>
           <w:rFonts w:ascii="Times New Roman" w:hAnsi="Times New Roman"/>
@@ -1026,11 +1073,11 @@
       </w:pPr>
       <w:r>
         <w:rPr>
-          <w:rFonts w:ascii="Times New Roman" w:hAnsi="Times New Roman"/>
-          <w:sz w:val="28"/>
-          <w:szCs w:val="28"/>
-        </w:rPr>
-        <w:t>В поликлинике генерируется список талонов к врачу. Каждая запись списка содержит: дату, время, № очереди, ФИО больного (изначально поле пустое), номер кабинета, код врача. Генерация талонов происходит на неделю, начиная с введенной даты, в соответствии с графиком работ врачей. График работ содержит код врача, специализацию врача, ФИО врача, временной диапазон работы на каждый день с понедельника по субботу. Требуется:</w:t>
+          <w:rFonts w:ascii="Times New Roman" w:hAnsi="Times New Roman" w:eastAsia="Times New Roman" w:cs="Times New Roman"/>
+          <w:sz w:val="28"/>
+          <w:szCs w:val="28"/>
+        </w:rPr>
+        <w:t>В поликлинике генерируется список талонов к врачу. Каждая запись списка содержит: дату, время, № очереди, ФИО больного (изначально поле пустое), номер кабинета, код врача. Генерация талонов происходит на неделю, начиная с введенной даты, в соответствии с графиком работ врачей. График работ содержит код врача, специализацию врача, ФИО врача, временной диапазон работы на каждый день с понедельника по суббоeту. Требуется:</w:t>
       </w:r>
     </w:p>
     <w:p>
@@ -1049,7 +1096,7 @@
       </w:pPr>
       <w:r>
         <w:rPr>
-          <w:rFonts w:ascii="Times New Roman" w:hAnsi="Times New Roman"/>
+          <w:rFonts w:ascii="Times New Roman" w:hAnsi="Times New Roman" w:eastAsia="Times New Roman" w:cs="Times New Roman"/>
           <w:sz w:val="28"/>
           <w:szCs w:val="28"/>
         </w:rPr>
@@ -1072,11 +1119,10 @@
       </w:pPr>
       <w:r>
         <w:rPr>
-          <w:rFonts w:ascii="Times New Roman" w:hAnsi="Times New Roman"/>
-          <w:sz w:val="28"/>
-          <w:szCs w:val="28"/>
-        </w:rPr>
-        <w:lastRenderedPageBreak/>
+          <w:rFonts w:ascii="Times New Roman" w:hAnsi="Times New Roman" w:eastAsia="Times New Roman" w:cs="Times New Roman"/>
+          <w:sz w:val="28"/>
+          <w:szCs w:val="28"/>
+        </w:rPr>
         <w:t>Осуществлять поиск всех записей к врачу на конкретную дату (ФИО врача ввести с клавиатуры);</w:t>
       </w:r>
     </w:p>
@@ -1096,7 +1142,7 @@
       </w:pPr>
       <w:r>
         <w:rPr>
-          <w:rFonts w:ascii="Times New Roman" w:hAnsi="Times New Roman"/>
+          <w:rFonts w:ascii="Times New Roman" w:hAnsi="Times New Roman" w:eastAsia="Times New Roman" w:cs="Times New Roman"/>
           <w:sz w:val="28"/>
           <w:szCs w:val="28"/>
         </w:rPr>
@@ -1119,7 +1165,7 @@
       </w:pPr>
       <w:r>
         <w:rPr>
-          <w:rFonts w:ascii="Times New Roman" w:hAnsi="Times New Roman"/>
+          <w:rFonts w:ascii="Times New Roman" w:hAnsi="Times New Roman" w:eastAsia="Times New Roman" w:cs="Times New Roman"/>
           <w:sz w:val="28"/>
           <w:szCs w:val="28"/>
         </w:rPr>
@@ -1128,7 +1174,7 @@
     </w:p>
     <w:p>
       <w:pPr>
-        <w:shd w:val="clear" w:color="auto" w:fill="FFFFFF"/>
+        <w:shd w:color="auto" w:fill="FFFFFF" w:val="clear"/>
         <w:tabs>
           <w:tab w:val="left" w:pos="916"/>
           <w:tab w:val="left" w:pos="1832"/>
@@ -1150,7 +1196,7 @@
         <w:spacing w:after="0" w:line="240" w:lineRule="auto"/>
         <w:jc w:val="both"/>
         <w:rPr>
-          <w:rFonts w:ascii="Times New Roman" w:eastAsia="Times New Roman" w:hAnsi="Times New Roman"/>
+          <w:rFonts w:ascii="Times New Roman" w:hAnsi="Times New Roman" w:eastAsia="Times New Roman"/>
           <w:color w:val="000000"/>
           <w:sz w:val="28"/>
           <w:szCs w:val="28"/>
@@ -1905,6 +1951,130 @@
       <w:lang w:eastAsia="ru-RU"/>
     </w:rPr>
   </w:style>
+  <w:style w:type="paragraph" w:default="1" w:styleId="Normal">
+    <w:name w:val="Normal"/>
+    <w:qFormat/>
+  </w:style>
+  <w:style w:type="paragraph" w:styleId="Title">
+    <w:name w:val="Title"/>
+    <w:basedOn w:val="Normal"/>
+    <w:next w:val="Normal"/>
+    <w:link w:val="TitleChar"/>
+    <w:uiPriority w:val="10"/>
+    <w:qFormat/>
+    <w:rsid w:val="00B72667"/>
+    <w:pPr>
+      <w:spacing w:after="80"/>
+      <w:contextualSpacing/>
+    </w:pPr>
+    <w:rPr>
+      <w:rFonts w:asciiTheme="majorHAnsi" w:eastAsiaTheme="majorEastAsia" w:hAnsiTheme="majorHAnsi" w:cstheme="majorBidi"/>
+      <w:spacing w:val="-10"/>
+      <w:kern w:val="28"/>
+      <w:sz w:val="56"/>
+      <w:szCs w:val="56"/>
+    </w:rPr>
+  </w:style>
+  <w:style w:type="paragraph" w:styleId="Subtitle">
+    <w:name w:val="Subtitle"/>
+    <w:basedOn w:val="Normal"/>
+    <w:next w:val="Normal"/>
+    <w:link w:val="SubtitleChar"/>
+    <w:uiPriority w:val="11"/>
+    <w:qFormat/>
+    <w:rsid w:val="00B72667"/>
+    <w:pPr>
+      <w:numPr>
+        <w:ilvl w:val="1"/>
+      </w:numPr>
+      <w:spacing w:after="160"/>
+    </w:pPr>
+    <w:rPr>
+      <w:rFonts w:asciiTheme="minorHAnsi" w:eastAsiaTheme="majorEastAsia" w:hAnsiTheme="minorHAnsi" w:cstheme="majorBidi"/>
+      <w:color w:val="595959" w:themeColor="text1" w:themeTint="A6"/>
+      <w:spacing w:val="15"/>
+      <w:sz w:val="28"/>
+      <w:szCs w:val="28"/>
+    </w:rPr>
+  </w:style>
+  <w:style w:type="paragraph" w:styleId="Heading1">
+    <w:name w:val="heading 1"/>
+    <w:basedOn w:val="Normal"/>
+    <w:next w:val="Normal"/>
+    <w:link w:val="Heading1Char"/>
+    <w:uiPriority w:val="9"/>
+    <w:qFormat/>
+    <w:rsid w:val="00233D7B"/>
+    <w:pPr>
+      <w:keepNext/>
+      <w:keepLines/>
+      <w:spacing w:before="360" w:after="80"/>
+      <w:outlineLvl w:val="0"/>
+    </w:pPr>
+    <w:rPr>
+      <w:rFonts w:asciiTheme="majorHAnsi" w:eastAsiaTheme="majorEastAsia" w:hAnsiTheme="majorHAnsi" w:cstheme="majorBidi"/>
+      <w:color w:val="0F4761" w:themeColor="accent1" w:themeShade="BF"/>
+      <w:sz w:val="40"/>
+      <w:szCs w:val="40"/>
+    </w:rPr>
+  </w:style>
+  <w:style w:type="paragraph" w:styleId="Heading2">
+    <w:name w:val="heading 2"/>
+    <w:basedOn w:val="Normal"/>
+    <w:next w:val="Normal"/>
+    <w:link w:val="Heading2Char"/>
+    <w:uiPriority w:val="9"/>
+    <w:semiHidden/>
+    <w:unhideWhenUsed/>
+    <w:qFormat/>
+    <w:rsid w:val="00233D7B"/>
+    <w:pPr>
+      <w:keepNext/>
+      <w:keepLines/>
+      <w:spacing w:before="160" w:after="80"/>
+      <w:outlineLvl w:val="1"/>
+    </w:pPr>
+    <w:rPr>
+      <w:rFonts w:asciiTheme="majorHAnsi" w:eastAsiaTheme="majorEastAsia" w:hAnsiTheme="majorHAnsi" w:cstheme="majorBidi"/>
+      <w:color w:val="0F4761" w:themeColor="accent1" w:themeShade="BF"/>
+      <w:sz w:val="32"/>
+      <w:szCs w:val="32"/>
+    </w:rPr>
+  </w:style>
+  <w:style w:type="paragraph" w:styleId="Heading3">
+    <w:name w:val="heading 3"/>
+    <w:basedOn w:val="Normal"/>
+    <w:next w:val="Normal"/>
+    <w:link w:val="Heading3Char"/>
+    <w:uiPriority w:val="9"/>
+    <w:semiHidden/>
+    <w:unhideWhenUsed/>
+    <w:qFormat/>
+    <w:rsid w:val="00233D7B"/>
+    <w:pPr>
+      <w:keepNext/>
+      <w:keepLines/>
+      <w:spacing w:before="160" w:after="80"/>
+      <w:outlineLvl w:val="2"/>
+    </w:pPr>
+    <w:rPr>
+      <w:rFonts w:eastAsiaTheme="majorEastAsia" w:cstheme="majorBidi"/>
+      <w:color w:val="0F4761" w:themeColor="accent1" w:themeShade="BF"/>
+      <w:sz w:val="28"/>
+      <w:szCs w:val="28"/>
+    </w:rPr>
+  </w:style>
+  <w:style w:styleId="Hyperlink" w:type="character">
+    <w:name w:val="Hyperlink"/>
+    <w:basedOn w:val="DefaultParagraphFont"/>
+    <w:uiPriority w:val="99"/>
+    <w:unhideWhenUsed/>
+    <w:rsid w:val="00D87CC4"/>
+    <w:rPr>
+      <w:color w:themeColor="hyperlink" w:val="467886"/>
+      <w:u w:val="single"/>
+    </w:rPr>
+  </w:style>
 </w:styles>
 </file>
 

</xml_diff>